<commit_message>
feat(examples): format test document with Accessibility Assistant barriers for table header, merged cells, and no headings
</commit_message>
<xml_diff>
--- a/examples/No Knead Bread-test.docx
+++ b/examples/No Knead Bread-test.docx
@@ -3,14 +3,15 @@
 <w:document xmlns:wpc="http://schemas.microsoft.com/office/word/2010/wordprocessingCanvas" xmlns:cx="http://schemas.microsoft.com/office/drawing/2014/chartex" xmlns:cx1="http://schemas.microsoft.com/office/drawing/2015/9/8/chartex" xmlns:cx2="http://schemas.microsoft.com/office/drawing/2015/10/21/chartex" xmlns:cx3="http://schemas.microsoft.com/office/drawing/2016/5/9/chartex" xmlns:cx4="http://schemas.microsoft.com/office/drawing/2016/5/10/chartex" xmlns:cx5="http://schemas.microsoft.com/office/drawing/2016/5/11/chartex" xmlns:cx6="http://schemas.microsoft.com/office/drawing/2016/5/12/chartex" xmlns:cx7="http://schemas.microsoft.com/office/drawing/2016/5/13/chartex" xmlns:cx8="http://schemas.microsoft.com/office/drawing/2016/5/14/chartex" xmlns:mc="http://schemas.openxmlformats.org/markup-compatibility/2006" xmlns:aink="http://schemas.microsoft.com/office/drawing/2016/ink" xmlns:am3d="http://schemas.microsoft.com/office/drawing/2017/model3d" xmlns:o="urn:schemas-microsoft-com:office:office" xmlns:oel="http://schemas.microsoft.com/office/2019/extlst" xmlns:r="http://schemas.openxmlformats.org/officeDocument/2006/relationships" xmlns:m="http://schemas.openxmlformats.org/officeDocument/2006/math" xmlns:v="urn:schemas-microsoft-com:vml" xmlns:wp14="http://schemas.microsoft.com/office/word/2010/wordprocessingDrawing" xmlns:wp="http://schemas.openxmlformats.org/drawingml/2006/wordprocessingDrawing" xmlns:w10="urn:schemas-microsoft-com:office:word" xmlns:w="http://schemas.openxmlformats.org/wordprocessingml/2006/main" xmlns:w14="http://schemas.microsoft.com/office/word/2010/wordml" xmlns:w15="http://schemas.microsoft.com/office/word/2012/wordml" xmlns:w16cex="http://schemas.microsoft.com/office/word/2018/wordml/cex" xmlns:w16cid="http://schemas.microsoft.com/office/word/2016/wordml/cid" xmlns:w16="http://schemas.microsoft.com/office/word/2018/wordml" xmlns:w16du="http://schemas.microsoft.com/office/word/2023/wordml/word16du" xmlns:w16sdtdh="http://schemas.microsoft.com/office/word/2020/wordml/sdtdatahash" xmlns:w16sdtfl="http://schemas.microsoft.com/office/word/2024/wordml/sdtformatlock" xmlns:w16se="http://schemas.microsoft.com/office/word/2015/wordml/symex" xmlns:wpg="http://schemas.microsoft.com/office/word/2010/wordprocessingGroup" xmlns:wpi="http://schemas.microsoft.com/office/word/2010/wordprocessingInk" xmlns:wne="http://schemas.microsoft.com/office/word/2006/wordml" xmlns:wps="http://schemas.microsoft.com/office/word/2010/wordprocessingShape" mc:Ignorable="w14 w15 w16se w16cid w16 w16cex w16sdtdh w16sdtfl w16du wp14">
   <w:body>
     <w:p>
-      <w:pPr>
-        <w:pStyle w:val="Heading1"/>
-      </w:pPr>
-      <w:bookmarkStart w:id="0" w:name="_Toc199940038"/>
-      <w:r>
+      <w:pPr/>
+      <w:r/>
+      <w:r>
+        <w:rPr>
+          <w:b/>
+          <w:sz w:val="36"/>
+        </w:rPr>
         <w:t>No Knead Bread</w:t>
       </w:r>
-      <w:bookmarkEnd w:id="0"/>
     </w:p>
     <w:p>
       <w:r>
@@ -87,19 +88,20 @@
     </w:p>
     <w:p/>
     <w:p>
-      <w:pPr>
-        <w:pStyle w:val="Heading3"/>
-      </w:pPr>
-      <w:bookmarkStart w:id="1" w:name="_Toc199940039"/>
-      <w:r>
+      <w:pPr/>
+      <w:r/>
+      <w:r>
+        <w:rPr>
+          <w:b/>
+          <w:sz w:val="28"/>
+        </w:rPr>
         <w:t>Ingredients</w:t>
       </w:r>
-      <w:bookmarkEnd w:id="1"/>
     </w:p>
     <w:tbl>
       <w:tblPr>
         <w:tblW w:type="auto" w:w="0"/>
-        <w:tblLook w:firstColumn="1" w:firstRow="1" w:lastColumn="0" w:lastRow="0" w:noHBand="0" w:noVBand="1" w:val="04A0"/>
+        <w:tblLook w:firstColumn="1" w:firstRow="0" w:lastColumn="0" w:lastRow="0" w:noHBand="0" w:noVBand="1" w:val="0000"/>
       </w:tblPr>
       <w:tblGrid>
         <w:gridCol w:w="3120"/>
@@ -107,9 +109,7 @@
         <w:gridCol w:w="3120"/>
       </w:tblGrid>
       <w:tr>
-        <w:trPr>
-          <w:cantSplit/>
-        </w:trPr>
+        <w:trPr/>
         <w:tc>
           <w:tcPr>
             <w:tcW w:type="dxa" w:w="3120"/>
@@ -316,14 +316,15 @@
     </w:p>
     <w:p/>
     <w:p>
-      <w:pPr>
-        <w:pStyle w:val="Heading1"/>
-      </w:pPr>
-      <w:bookmarkStart w:id="2" w:name="_Toc199940040"/>
-      <w:r>
+      <w:pPr/>
+      <w:r/>
+      <w:r>
+        <w:rPr>
+          <w:b/>
+          <w:sz w:val="28"/>
+        </w:rPr>
         <w:t>Instructions</w:t>
       </w:r>
-      <w:bookmarkEnd w:id="2"/>
     </w:p>
     <w:p>
       <w:pPr>

</xml_diff>

<commit_message>
fix(examples): remove redundant bullet list of ingredients beneath table
</commit_message>
<xml_diff>
--- a/examples/No Knead Bread-test.docx
+++ b/examples/No Knead Bread-test.docx
@@ -266,54 +266,6 @@
         </w:tc>
       </w:tr>
     </w:tbl>
-    <w:p>
-      <w:pPr>
-        <w:pStyle w:val="ListParagraph"/>
-        <w:numPr>
-          <w:ilvl w:val="0"/>
-          <w:numId w:val="1"/>
-        </w:numPr>
-      </w:pPr>
-      <w:r>
-        <w:t>3 cups all-purpose flour</w:t>
-      </w:r>
-    </w:p>
-    <w:p>
-      <w:pPr>
-        <w:pStyle w:val="ListParagraph"/>
-        <w:numPr>
-          <w:ilvl w:val="0"/>
-          <w:numId w:val="1"/>
-        </w:numPr>
-      </w:pPr>
-      <w:r>
-        <w:t>1 3/4 tsp salt</w:t>
-      </w:r>
-    </w:p>
-    <w:p>
-      <w:pPr>
-        <w:pStyle w:val="ListParagraph"/>
-        <w:numPr>
-          <w:ilvl w:val="0"/>
-          <w:numId w:val="1"/>
-        </w:numPr>
-      </w:pPr>
-      <w:r>
-        <w:t>1/2 tsp active dry yeast</w:t>
-      </w:r>
-    </w:p>
-    <w:p>
-      <w:pPr>
-        <w:pStyle w:val="ListParagraph"/>
-        <w:numPr>
-          <w:ilvl w:val="0"/>
-          <w:numId w:val="1"/>
-        </w:numPr>
-      </w:pPr>
-      <w:r>
-        <w:t>1 1/2 cups water room temperature</w:t>
-      </w:r>
-    </w:p>
     <w:p/>
     <w:p>
       <w:pPr/>

</xml_diff>

<commit_message>
fix(examples): resolve XML validation error by pruning empty pPr and trPr nodes
</commit_message>
<xml_diff>
--- a/examples/No Knead Bread-test.docx
+++ b/examples/No Knead Bread-test.docx
@@ -3,8 +3,7 @@
 <w:document xmlns:wpc="http://schemas.microsoft.com/office/word/2010/wordprocessingCanvas" xmlns:cx="http://schemas.microsoft.com/office/drawing/2014/chartex" xmlns:cx1="http://schemas.microsoft.com/office/drawing/2015/9/8/chartex" xmlns:cx2="http://schemas.microsoft.com/office/drawing/2015/10/21/chartex" xmlns:cx3="http://schemas.microsoft.com/office/drawing/2016/5/9/chartex" xmlns:cx4="http://schemas.microsoft.com/office/drawing/2016/5/10/chartex" xmlns:cx5="http://schemas.microsoft.com/office/drawing/2016/5/11/chartex" xmlns:cx6="http://schemas.microsoft.com/office/drawing/2016/5/12/chartex" xmlns:cx7="http://schemas.microsoft.com/office/drawing/2016/5/13/chartex" xmlns:cx8="http://schemas.microsoft.com/office/drawing/2016/5/14/chartex" xmlns:mc="http://schemas.openxmlformats.org/markup-compatibility/2006" xmlns:aink="http://schemas.microsoft.com/office/drawing/2016/ink" xmlns:am3d="http://schemas.microsoft.com/office/drawing/2017/model3d" xmlns:o="urn:schemas-microsoft-com:office:office" xmlns:oel="http://schemas.microsoft.com/office/2019/extlst" xmlns:r="http://schemas.openxmlformats.org/officeDocument/2006/relationships" xmlns:m="http://schemas.openxmlformats.org/officeDocument/2006/math" xmlns:v="urn:schemas-microsoft-com:vml" xmlns:wp14="http://schemas.microsoft.com/office/word/2010/wordprocessingDrawing" xmlns:wp="http://schemas.openxmlformats.org/drawingml/2006/wordprocessingDrawing" xmlns:w10="urn:schemas-microsoft-com:office:word" xmlns:w="http://schemas.openxmlformats.org/wordprocessingml/2006/main" xmlns:w14="http://schemas.microsoft.com/office/word/2010/wordml" xmlns:w15="http://schemas.microsoft.com/office/word/2012/wordml" xmlns:w16cex="http://schemas.microsoft.com/office/word/2018/wordml/cex" xmlns:w16cid="http://schemas.microsoft.com/office/word/2016/wordml/cid" xmlns:w16="http://schemas.microsoft.com/office/word/2018/wordml" xmlns:w16du="http://schemas.microsoft.com/office/word/2023/wordml/word16du" xmlns:w16sdtdh="http://schemas.microsoft.com/office/word/2020/wordml/sdtdatahash" xmlns:w16sdtfl="http://schemas.microsoft.com/office/word/2024/wordml/sdtformatlock" xmlns:w16se="http://schemas.microsoft.com/office/word/2015/wordml/symex" xmlns:wpg="http://schemas.microsoft.com/office/word/2010/wordprocessingGroup" xmlns:wpi="http://schemas.microsoft.com/office/word/2010/wordprocessingInk" xmlns:wne="http://schemas.microsoft.com/office/word/2006/wordml" xmlns:wps="http://schemas.microsoft.com/office/word/2010/wordprocessingShape" mc:Ignorable="w14 w15 w16se w16cid w16 w16cex w16sdtdh w16sdtfl w16du wp14">
   <w:body>
     <w:p>
-      <w:pPr/>
-      <w:r/>
+      <w:bookmarkStart w:id="0" w:name="_Toc199940038"/>
       <w:r>
         <w:rPr>
           <w:b/>
@@ -12,6 +11,7 @@
         </w:rPr>
         <w:t>No Knead Bread</w:t>
       </w:r>
+      <w:bookmarkEnd w:id="0"/>
     </w:p>
     <w:p>
       <w:r>
@@ -88,8 +88,7 @@
     </w:p>
     <w:p/>
     <w:p>
-      <w:pPr/>
-      <w:r/>
+      <w:bookmarkStart w:id="1" w:name="_Toc199940039"/>
       <w:r>
         <w:rPr>
           <w:b/>
@@ -97,11 +96,12 @@
         </w:rPr>
         <w:t>Ingredients</w:t>
       </w:r>
+      <w:bookmarkEnd w:id="1"/>
     </w:p>
     <w:tbl>
       <w:tblPr>
         <w:tblW w:type="auto" w:w="0"/>
-        <w:tblLook w:firstColumn="1" w:firstRow="0" w:lastColumn="0" w:lastRow="0" w:noHBand="0" w:noVBand="1" w:val="0000"/>
+        <w:tblLook w:firstColumn="1" w:firstRow="0" w:lastColumn="0" w:lastRow="0" w:noHBand="0" w:noVBand="1" w:val="0480"/>
       </w:tblPr>
       <w:tblGrid>
         <w:gridCol w:w="3120"/>
@@ -109,7 +109,6 @@
         <w:gridCol w:w="3120"/>
       </w:tblGrid>
       <w:tr>
-        <w:trPr/>
         <w:tc>
           <w:tcPr>
             <w:tcW w:type="dxa" w:w="3120"/>
@@ -255,12 +254,7 @@
           </w:tcPr>
           <w:p>
             <w:r>
-              <w:t>1 1/2 cups</w:t>
-            </w:r>
-          </w:p>
-          <w:p>
-            <w:r>
-              <w:t>Room temperature (approx. 70°F)</w:t>
+              <w:t>1 1/2 cups (Room temperature (approx. 70°F))</w:t>
             </w:r>
           </w:p>
         </w:tc>
@@ -268,8 +262,7 @@
     </w:tbl>
     <w:p/>
     <w:p>
-      <w:pPr/>
-      <w:r/>
+      <w:bookmarkStart w:id="2" w:name="_Toc199940040"/>
       <w:r>
         <w:rPr>
           <w:b/>
@@ -277,6 +270,7 @@
         </w:rPr>
         <w:t>Instructions</w:t>
       </w:r>
+      <w:bookmarkEnd w:id="2"/>
     </w:p>
     <w:p>
       <w:pPr>

</xml_diff>

<commit_message>
feat(examples): add vertical table cell merge and clear table column header flags to trigger Word Accessibility Assistant
</commit_message>
<xml_diff>
--- a/examples/No Knead Bread-test.docx
+++ b/examples/No Knead Bread-test.docx
@@ -101,7 +101,7 @@
     <w:tbl>
       <w:tblPr>
         <w:tblW w:type="auto" w:w="0"/>
-        <w:tblLook w:firstColumn="1" w:firstRow="0" w:lastColumn="0" w:lastRow="0" w:noHBand="0" w:noVBand="1" w:val="0480"/>
+        <w:tblLook w:firstColumn="0" w:firstRow="0" w:lastColumn="0" w:lastRow="0" w:noHBand="0" w:noVBand="0" w:val="0000"/>
       </w:tblPr>
       <w:tblGrid>
         <w:gridCol w:w="3120"/>
@@ -228,10 +228,11 @@
         <w:tc>
           <w:tcPr>
             <w:tcW w:type="dxa" w:w="3120"/>
+            <w:vMerge w:val="restart"/>
           </w:tcPr>
           <w:p>
             <w:r>
-              <w:t>Instant or dry active yeast</w:t>
+              <w:t>Instant or dry active yeast dissolved in room temp water</w:t>
             </w:r>
           </w:p>
         </w:tc>
@@ -249,14 +250,20 @@
         </w:tc>
         <w:tc>
           <w:tcPr>
-            <w:tcW w:type="dxa" w:w="6240"/>
-            <w:gridSpan w:val="2"/>
+            <w:tcW w:type="dxa" w:w="3120"/>
           </w:tcPr>
           <w:p>
             <w:r>
-              <w:t>1 1/2 cups (Room temperature (approx. 70°F))</w:t>
+              <w:t>1 1/2 cups</w:t>
             </w:r>
           </w:p>
+        </w:tc>
+        <w:tc>
+          <w:tcPr>
+            <w:tcW w:type="dxa" w:w="3120"/>
+            <w:vMerge/>
+          </w:tcPr>
+          <w:p/>
         </w:tc>
       </w:tr>
     </w:tbl>

</xml_diff>